<commit_message>
Refactor backend Business Logic to TramiteService and created frontend custom hooks useAuth and useNotificaciones
</commit_message>
<xml_diff>
--- a/backend/src/main/resources/templates/CARTA RESIDENCIA JUNTA DE ACCION.docx
+++ b/backend/src/main/resources/templates/CARTA RESIDENCIA JUNTA DE ACCION.docx
@@ -44,7 +44,6 @@
     </w:p>
     <w:p>
       <w:pPr>
-        <w:spacing w:line="276" w:lineRule="auto"/>
         <w:jc w:val="center"/>
         <w:rPr>
           <w:rFonts w:ascii="Maven Pro" w:hAnsi="Maven Pro" w:cs="Tahoma"/>
@@ -57,20 +56,6 @@
     </w:p>
     <w:p>
       <w:pPr>
-        <w:spacing w:line="276" w:lineRule="auto"/>
-        <w:jc w:val="center"/>
-        <w:rPr>
-          <w:rFonts w:ascii="Maven Pro" w:hAnsi="Maven Pro" w:cs="Tahoma"/>
-          <w:b/>
-          <w:bCs/>
-          <w:sz w:val="23"/>
-          <w:szCs w:val="23"/>
-        </w:rPr>
-      </w:pPr>
-    </w:p>
-    <w:p>
-      <w:pPr>
-        <w:spacing w:line="276" w:lineRule="auto"/>
         <w:jc w:val="center"/>
         <w:outlineLvl w:val="0"/>
         <w:rPr>
@@ -95,7 +80,6 @@
         <w:tabs>
           <w:tab w:val="left" w:pos="2700"/>
         </w:tabs>
-        <w:spacing w:line="276" w:lineRule="auto"/>
         <w:rPr>
           <w:rFonts w:ascii="Maven Pro" w:hAnsi="Maven Pro" w:cs="Tahoma"/>
           <w:b/>
@@ -123,7 +107,6 @@
     </w:p>
     <w:p>
       <w:pPr>
-        <w:spacing w:line="276" w:lineRule="auto"/>
         <w:jc w:val="center"/>
         <w:rPr>
           <w:rFonts w:ascii="Maven Pro" w:hAnsi="Maven Pro" w:cs="Tahoma"/>
@@ -134,7 +117,6 @@
     </w:p>
     <w:p>
       <w:pPr>
-        <w:spacing w:line="276" w:lineRule="auto"/>
         <w:rPr>
           <w:rFonts w:ascii="Maven Pro" w:hAnsi="Maven Pro" w:cs="Arial"/>
           <w:b/>
@@ -319,7 +301,6 @@
     </w:p>
     <w:p>
       <w:pPr>
-        <w:spacing w:line="276" w:lineRule="auto"/>
         <w:rPr>
           <w:rFonts w:ascii="Maven Pro" w:hAnsi="Maven Pro" w:cs="Arial"/>
           <w:sz w:val="24"/>
@@ -371,7 +352,6 @@
     </w:p>
     <w:p>
       <w:pPr>
-        <w:spacing w:line="276" w:lineRule="auto"/>
         <w:rPr>
           <w:rFonts w:ascii="Maven Pro" w:hAnsi="Maven Pro" w:cs="Arial"/>
           <w:sz w:val="24"/>
@@ -553,7 +533,6 @@
         <w:tabs>
           <w:tab w:val="left" w:pos="6600"/>
         </w:tabs>
-        <w:spacing w:line="276" w:lineRule="auto"/>
         <w:rPr>
           <w:rFonts w:ascii="Maven Pro" w:hAnsi="Maven Pro" w:cs="Tahoma"/>
           <w:b/>
@@ -567,7 +546,6 @@
         <w:tabs>
           <w:tab w:val="left" w:pos="6600"/>
         </w:tabs>
-        <w:spacing w:line="276" w:lineRule="auto"/>
         <w:rPr>
           <w:rFonts w:ascii="Maven Pro" w:hAnsi="Maven Pro" w:cs="Tahoma"/>
           <w:b/>
@@ -581,7 +559,6 @@
         <w:tabs>
           <w:tab w:val="left" w:pos="6600"/>
         </w:tabs>
-        <w:spacing w:line="276" w:lineRule="auto"/>
         <w:rPr>
           <w:rFonts w:ascii="Maven Pro" w:hAnsi="Maven Pro" w:cs="Tahoma"/>
           <w:b/>
@@ -595,7 +572,6 @@
         <w:tabs>
           <w:tab w:val="left" w:pos="6600"/>
         </w:tabs>
-        <w:spacing w:line="276" w:lineRule="auto"/>
         <w:rPr>
           <w:rFonts w:ascii="Maven Pro" w:hAnsi="Maven Pro" w:cs="Tahoma"/>
           <w:b/>
@@ -609,7 +585,6 @@
         <w:tabs>
           <w:tab w:val="left" w:pos="6600"/>
         </w:tabs>
-        <w:spacing w:line="276" w:lineRule="auto"/>
         <w:rPr>
           <w:rFonts w:ascii="Maven Pro" w:hAnsi="Maven Pro" w:cs="Tahoma"/>
           <w:b/>
@@ -623,7 +598,6 @@
         <w:tabs>
           <w:tab w:val="left" w:pos="6600"/>
         </w:tabs>
-        <w:spacing w:line="276" w:lineRule="auto"/>
         <w:rPr>
           <w:rFonts w:ascii="Maven Pro" w:hAnsi="Maven Pro" w:cs="Tahoma"/>
           <w:b/>
@@ -646,7 +620,6 @@
         <w:tabs>
           <w:tab w:val="left" w:pos="6600"/>
         </w:tabs>
-        <w:spacing w:line="276" w:lineRule="auto"/>
         <w:rPr>
           <w:rFonts w:ascii="Maven Pro" w:hAnsi="Maven Pro" w:cs="Tahoma"/>
           <w:sz w:val="24"/>
@@ -664,7 +637,6 @@
     </w:p>
     <w:p>
       <w:pPr>
-        <w:spacing w:line="276" w:lineRule="auto"/>
         <w:outlineLvl w:val="0"/>
         <w:rPr>
           <w:rFonts w:ascii="Maven Pro" w:hAnsi="Maven Pro" w:cs="Tahoma"/>
@@ -693,7 +665,6 @@
     </w:p>
     <w:p>
       <w:pPr>
-        <w:spacing w:line="276" w:lineRule="auto"/>
         <w:outlineLvl w:val="0"/>
         <w:rPr>
           <w:rFonts w:ascii="Maven Pro" w:hAnsi="Maven Pro" w:cs="Tahoma"/>
@@ -722,7 +693,6 @@
           </w:tcPr>
           <w:p>
             <w:pPr>
-              <w:spacing w:line="276" w:lineRule="auto"/>
               <w:rPr>
                 <w:rFonts w:ascii="Maven Pro" w:hAnsi="Maven Pro" w:cs="Tahoma"/>
                 <w:b/>
@@ -758,7 +728,6 @@
           </w:tcPr>
           <w:p>
             <w:pPr>
-              <w:spacing w:line="276" w:lineRule="auto"/>
               <w:rPr>
                 <w:rFonts w:ascii="Maven Pro" w:hAnsi="Maven Pro" w:cs="Tahoma"/>
                 <w:b/>
@@ -794,7 +763,6 @@
           </w:tcPr>
           <w:p>
             <w:pPr>
-              <w:spacing w:line="276" w:lineRule="auto"/>
               <w:rPr>
                 <w:rFonts w:ascii="Maven Pro" w:hAnsi="Maven Pro" w:cs="Tahoma"/>
                 <w:b/>
@@ -821,7 +789,6 @@
           </w:tcPr>
           <w:p>
             <w:pPr>
-              <w:spacing w:line="276" w:lineRule="auto"/>
               <w:rPr>
                 <w:rFonts w:ascii="Maven Pro" w:hAnsi="Maven Pro" w:cs="Tahoma"/>
                 <w:b/>
@@ -846,7 +813,6 @@
           </w:tcPr>
           <w:p>
             <w:pPr>
-              <w:spacing w:line="276" w:lineRule="auto"/>
               <w:rPr>
                 <w:rFonts w:ascii="Maven Pro" w:hAnsi="Maven Pro" w:cs="Tahoma"/>
                 <w:b/>
@@ -871,7 +837,6 @@
           </w:tcPr>
           <w:p>
             <w:pPr>
-              <w:spacing w:line="276" w:lineRule="auto"/>
               <w:rPr>
                 <w:rFonts w:ascii="Maven Pro" w:hAnsi="Maven Pro" w:cs="Tahoma"/>
                 <w:b/>
@@ -898,7 +863,6 @@
           </w:tcPr>
           <w:p>
             <w:pPr>
-              <w:spacing w:line="276" w:lineRule="auto"/>
               <w:rPr>
                 <w:rFonts w:ascii="Maven Pro" w:hAnsi="Maven Pro" w:cs="Tahoma"/>
                 <w:sz w:val="16"/>
@@ -948,7 +912,6 @@
           </w:tcPr>
           <w:p>
             <w:pPr>
-              <w:spacing w:line="276" w:lineRule="auto"/>
               <w:rPr>
                 <w:rFonts w:ascii="Maven Pro" w:hAnsi="Maven Pro" w:cs="Tahoma"/>
                 <w:sz w:val="16"/>
@@ -998,7 +961,6 @@
           </w:tcPr>
           <w:p>
             <w:pPr>
-              <w:spacing w:line="276" w:lineRule="auto"/>
               <w:rPr>
                 <w:rFonts w:ascii="Maven Pro" w:hAnsi="Maven Pro" w:cs="Tahoma"/>
                 <w:sz w:val="16"/>
@@ -1048,7 +1010,6 @@
     </w:tbl>
     <w:p>
       <w:pPr>
-        <w:spacing w:line="276" w:lineRule="auto"/>
         <w:rPr>
           <w:rFonts w:ascii="Maven Pro" w:hAnsi="Maven Pro" w:cs="Arial"/>
           <w:sz w:val="24"/>
@@ -1061,7 +1022,7 @@
       <w:headerReference w:type="first" r:id="rId10"/>
       <w:footerReference w:type="first" r:id="rId11"/>
       <w:pgSz w:w="12240" w:h="15840"/>
-      <w:pgMar w:top="1418" w:right="1324" w:bottom="1418" w:left="1418" w:header="567" w:footer="284" w:gutter="0"/>
+      <w:pgMar w:top="1418" w:right="1324" w:bottom="1418" w:left="1418" w:header="426" w:footer="224" w:gutter="0"/>
       <w:pgNumType w:start="1"/>
       <w:cols w:space="720"/>
       <w:formProt w:val="0"/>
@@ -1158,7 +1119,7 @@
               <wp:inline distT="0" distB="0" distL="0" distR="0" wp14:anchorId="292E2F8D" wp14:editId="6BE3031F">
                 <wp:extent cx="937260" cy="435610"/>
                 <wp:effectExtent l="0" t="0" r="0" b="0"/>
-                <wp:docPr id="3" name="Imagen 1"/>
+                <wp:docPr id="2003202468" name="Imagen 1"/>
                 <wp:cNvGraphicFramePr>
                   <a:graphicFrameLocks xmlns:a="http://schemas.openxmlformats.org/drawingml/2006/main" noChangeAspect="1"/>
                 </wp:cNvGraphicFramePr>
@@ -1412,7 +1373,7 @@
               <wp:inline distT="0" distB="0" distL="0" distR="0" wp14:anchorId="16440367" wp14:editId="4A434462">
                 <wp:extent cx="561340" cy="586740"/>
                 <wp:effectExtent l="0" t="0" r="0" b="0"/>
-                <wp:docPr id="5" name="Imagen3" descr="Código QR&#10;&#10;Descripción generada automáticamente"/>
+                <wp:docPr id="884320271" name="Imagen3" descr="Código QR&#10;&#10;Descripción generada automáticamente"/>
                 <wp:cNvGraphicFramePr>
                   <a:graphicFrameLocks xmlns:a="http://schemas.openxmlformats.org/drawingml/2006/main" noChangeAspect="1"/>
                 </wp:cNvGraphicFramePr>
@@ -1723,7 +1684,7 @@
               <wp:inline distT="0" distB="0" distL="0" distR="0" wp14:anchorId="10332177" wp14:editId="14977D51">
                 <wp:extent cx="937260" cy="435610"/>
                 <wp:effectExtent l="0" t="0" r="0" b="0"/>
-                <wp:docPr id="6" name="Imagen 1"/>
+                <wp:docPr id="839001462" name="Imagen 1"/>
                 <wp:cNvGraphicFramePr>
                   <a:graphicFrameLocks xmlns:a="http://schemas.openxmlformats.org/drawingml/2006/main" noChangeAspect="1"/>
                 </wp:cNvGraphicFramePr>
@@ -1976,7 +1937,7 @@
               <wp:inline distT="0" distB="0" distL="0" distR="0" wp14:anchorId="6ABFD53B" wp14:editId="5C64296D">
                 <wp:extent cx="561340" cy="586740"/>
                 <wp:effectExtent l="0" t="0" r="0" b="0"/>
-                <wp:docPr id="8" name="Imagen3" descr="Código QR&#10;&#10;Descripción generada automáticamente"/>
+                <wp:docPr id="948818500" name="Imagen3" descr="Código QR&#10;&#10;Descripción generada automáticamente"/>
                 <wp:cNvGraphicFramePr>
                   <a:graphicFrameLocks xmlns:a="http://schemas.openxmlformats.org/drawingml/2006/main" noChangeAspect="1"/>
                 </wp:cNvGraphicFramePr>
@@ -2331,7 +2292,7 @@
                 <wp:extent cx="1314450" cy="800100"/>
                 <wp:effectExtent l="0" t="0" r="0" b="0"/>
                 <wp:wrapNone/>
-                <wp:docPr id="1" name="image1.jpg" descr="Imagen que contiene Logotipo&#10;&#10;Descripción generada automáticamente"/>
+                <wp:docPr id="590408369" name="image1.jpg" descr="Imagen que contiene Logotipo&#10;&#10;Descripción generada automáticamente"/>
                 <wp:cNvGraphicFramePr>
                   <a:graphicFrameLocks xmlns:a="http://schemas.openxmlformats.org/drawingml/2006/main" noChangeAspect="1"/>
                 </wp:cNvGraphicFramePr>
@@ -3068,7 +3029,7 @@
                 <wp:extent cx="1314450" cy="800100"/>
                 <wp:effectExtent l="0" t="0" r="0" b="0"/>
                 <wp:wrapNone/>
-                <wp:docPr id="2" name="image1.jpg" descr="Imagen que contiene Logotipo&#10;&#10;Descripción generada automáticamente"/>
+                <wp:docPr id="2095986856" name="image1.jpg" descr="Imagen que contiene Logotipo&#10;&#10;Descripción generada automáticamente"/>
                 <wp:cNvGraphicFramePr>
                   <a:graphicFrameLocks xmlns:a="http://schemas.openxmlformats.org/drawingml/2006/main" noChangeAspect="1"/>
                 </wp:cNvGraphicFramePr>

</xml_diff>

<commit_message>
Certificados: PDF docx4j real + hash visible + hash como código verificación + Maven Pro fonts
</commit_message>
<xml_diff>
--- a/backend/src/main/resources/templates/CARTA RESIDENCIA JUNTA DE ACCION.docx
+++ b/backend/src/main/resources/templates/CARTA RESIDENCIA JUNTA DE ACCION.docx
@@ -579,32 +579,6 @@
           <w:szCs w:val="23"/>
         </w:rPr>
       </w:pPr>
-    </w:p>
-    <w:p>
-      <w:pPr>
-        <w:tabs>
-          <w:tab w:val="left" w:pos="6600"/>
-        </w:tabs>
-        <w:rPr>
-          <w:rFonts w:ascii="Maven Pro" w:hAnsi="Maven Pro" w:cs="Tahoma"/>
-          <w:b/>
-          <w:sz w:val="23"/>
-          <w:szCs w:val="23"/>
-        </w:rPr>
-      </w:pPr>
-    </w:p>
-    <w:p>
-      <w:pPr>
-        <w:tabs>
-          <w:tab w:val="left" w:pos="6600"/>
-        </w:tabs>
-        <w:rPr>
-          <w:rFonts w:ascii="Maven Pro" w:hAnsi="Maven Pro" w:cs="Tahoma"/>
-          <w:b/>
-          <w:sz w:val="23"/>
-          <w:szCs w:val="23"/>
-        </w:rPr>
-      </w:pPr>
       <w:r>
         <w:rPr>
           <w:rFonts w:ascii="Maven Pro" w:hAnsi="Maven Pro" w:cs="Tahoma"/>
@@ -7252,10 +7226,6 @@
 </file>
 
 <file path=customXml/item1.xml><?xml version="1.0" encoding="utf-8"?>
-<b:Sources xmlns:b="http://schemas.openxmlformats.org/officeDocument/2006/bibliography" xmlns="http://schemas.openxmlformats.org/officeDocument/2006/bibliography" SelectedStyle="\APASixthEditionOfficeOnline.xsl" StyleName="APA" Version="6"/>
-</file>
-
-<file path=customXml/item2.xml><?xml version="1.0" encoding="utf-8"?>
 <s:customData xmlns="http://www.wps.cn/officeDocument/2013/wpsCustomData" xmlns:s="http://www.wps.cn/officeDocument/2013/wpsCustomData">
   <customSectProps/>
   <customShpExts>
@@ -7264,18 +7234,22 @@
 </s:customData>
 </file>
 
+<file path=customXml/item2.xml><?xml version="1.0" encoding="utf-8"?>
+<b:Sources xmlns:b="http://schemas.openxmlformats.org/officeDocument/2006/bibliography" xmlns="http://schemas.openxmlformats.org/officeDocument/2006/bibliography" SelectedStyle="\APASixthEditionOfficeOnline.xsl" StyleName="APA" Version="6"/>
+</file>
+
 <file path=customXml/itemProps1.xml><?xml version="1.0" encoding="utf-8"?>
+<ds:datastoreItem xmlns:ds="http://schemas.openxmlformats.org/officeDocument/2006/customXml" ds:itemID="{B1977F7D-205B-4081-913C-38D41E755F92}">
+  <ds:schemaRefs>
+    <ds:schemaRef ds:uri="http://www.wps.cn/officeDocument/2013/wpsCustomData"/>
+  </ds:schemaRefs>
+</ds:datastoreItem>
+</file>
+
+<file path=customXml/itemProps2.xml><?xml version="1.0" encoding="utf-8"?>
 <ds:datastoreItem xmlns:ds="http://schemas.openxmlformats.org/officeDocument/2006/customXml" ds:itemID="{57A9E1C8-2F74-4495-A02D-86D169A6004A}">
   <ds:schemaRefs>
     <ds:schemaRef ds:uri="http://schemas.openxmlformats.org/officeDocument/2006/bibliography"/>
   </ds:schemaRefs>
 </ds:datastoreItem>
-</file>
-
-<file path=customXml/itemProps2.xml><?xml version="1.0" encoding="utf-8"?>
-<ds:datastoreItem xmlns:ds="http://schemas.openxmlformats.org/officeDocument/2006/customXml" ds:itemID="{B1977F7D-205B-4081-913C-38D41E755F92}">
-  <ds:schemaRefs>
-    <ds:schemaRef ds:uri="http://www.wps.cn/officeDocument/2013/wpsCustomData"/>
-  </ds:schemaRefs>
-</ds:datastoreItem>
 </file>
</xml_diff>